<commit_message>
Add Integrated MICE Email Lesson to the website; trim worksheet to output only
New interactive page (courses/mice/integrated-email-lesson/) delivers
Parts 1-5 and 7 of the lesson on screen: the warm-up, 4 example
emails with an auto-graded purpose-matching activity, the 8-part
structure guide, the language bank, a guided-practice walkthrough,
and a self-check practice round. Registered in the Practice Hub
catalog. Includes a teacher.html with timing, common problems, and
the full TQF/OBE alignment.

The printed output worksheet now covers only Part 6 onward (scenario
choice, planning boxes, final email, self/peer-check checklist,
submission) since the teaching content lives on the website instead
-- down from 6 pages to 3. Teacher plan updated to reflect the
website/worksheet split. Also fixed "enquiry/programme" (British) to
"inquiry/program" (American) across all new files, per the site's
American English standard.

Co-Authored-By: Claude Sonnet 5 <noreply@anthropic.com>
</commit_message>
<xml_diff>
--- a/_deliverables/MICE-IntegratedEmailLesson-TeacherPlan.docx
+++ b/_deliverables/MICE-IntegratedEmailLesson-TeacherPlan.docx
@@ -410,6 +410,57 @@
                 <w:sz w:val="19"/>
                 <w:szCs w:val="19"/>
               </w:rPr>
+              <w:t xml:space="preserve">Website</w:t>
+            </w:r>
+          </w:p>
+        </w:tc>
+        <w:tc>
+          <w:tcPr>
+            <w:tcW w:type="dxa" w:w="7360"/>
+            <w:tcMar>
+              <w:top w:type="dxa" w:w="90"/>
+              <w:left w:type="dxa" w:w="110"/>
+              <w:bottom w:type="dxa" w:w="90"/>
+              <w:right w:type="dxa" w:w="110"/>
+            </w:tcMar>
+            <w:vAlign w:val="center"/>
+          </w:tcPr>
+          <w:p>
+            <w:r>
+              <w:rPr>
+                <w:rFonts w:ascii="Times New Roman" w:cs="Times New Roman" w:eastAsia="Times New Roman" w:hAnsi="Times New Roman"/>
+                <w:b w:val="false"/>
+                <w:bCs w:val="false"/>
+                <w:sz w:val="19"/>
+                <w:szCs w:val="19"/>
+              </w:rPr>
+              <w:t xml:space="preserve">courses/mice/integrated-email-lesson/ — carries Parts 1–5 and 7 (teaching + practice). Part 6 (the graded output) is on the printed worksheet, not on screen.</w:t>
+            </w:r>
+          </w:p>
+        </w:tc>
+      </w:tr>
+      <w:tr>
+        <w:tc>
+          <w:tcPr>
+            <w:tcW w:type="dxa" w:w="2000"/>
+            <w:shd w:fill="F2F4F7" w:val="clear"/>
+            <w:tcMar>
+              <w:top w:type="dxa" w:w="90"/>
+              <w:left w:type="dxa" w:w="110"/>
+              <w:bottom w:type="dxa" w:w="90"/>
+              <w:right w:type="dxa" w:w="110"/>
+            </w:tcMar>
+            <w:vAlign w:val="center"/>
+          </w:tcPr>
+          <w:p>
+            <w:r>
+              <w:rPr>
+                <w:rFonts w:ascii="Times New Roman" w:cs="Times New Roman" w:eastAsia="Times New Roman" w:hAnsi="Times New Roman"/>
+                <w:b/>
+                <w:bCs/>
+                <w:sz w:val="19"/>
+                <w:szCs w:val="19"/>
+              </w:rPr>
               <w:t xml:space="preserve">Output</w:t>
             </w:r>
           </w:p>
@@ -488,7 +539,7 @@
           <w:sz w:val="20"/>
           <w:szCs w:val="20"/>
         </w:rPr>
-        <w:t xml:space="preserve">•  Identify the purpose of different types of professional MICE emails (enquiry, request, confirmation, apology/problem response).</w:t>
+        <w:t xml:space="preserve">•  Identify the purpose of different types of professional MICE emails (inquiry, request, confirmation, apology/problem response).</w:t>
       </w:r>
     </w:p>
     <w:p>
@@ -551,7 +602,7 @@
           <w:sz w:val="19"/>
           <w:szCs w:val="19"/>
         </w:rPr>
-        <w:t xml:space="preserve">Materials: one worksheet per student, board or projector, timer. The worksheet contains all four example emails, the structure guide, the language bank, the planning boxes, the scenario cards, and the checklist — it is designed to be taught directly from this plan.</w:t>
+        <w:t xml:space="preserve">Materials: the website page (courses/mice/integrated-email-lesson/), projected, carries Parts 1-5 and 7 — the warm-up, the 4 example emails, the structure guide, the language bank, the guided practice, and a self-check practice round. One printed output worksheet per student carries only Part 6 (scenario choice, planning boxes, final email) and the submitted self/peer-check checklist — this is the piece collected and marked.</w:t>
       </w:r>
     </w:p>
     <w:p>
@@ -1548,7 +1599,7 @@
           <w:sz w:val="20"/>
           <w:szCs w:val="20"/>
         </w:rPr>
-        <w:t xml:space="preserve">•  Students work in pairs. They read all 4 example emails on the worksheet (Enquiry, Request, Confirmation, Apology/Problem Response).</w:t>
+        <w:t xml:space="preserve">•  Students work in pairs. They read all 4 example emails on screen (Inquiry, Request, Confirmation, Apology/Problem Response) and choose each one’s purpose — the site gives instant feedback.</w:t>
       </w:r>
     </w:p>
     <w:p>
@@ -1782,7 +1833,7 @@
           <w:sz w:val="20"/>
           <w:szCs w:val="20"/>
         </w:rPr>
-        <w:t xml:space="preserve">•  Go through the Language Bank on the worksheet together. Choral-read 2–3 lines from each category aloud.</w:t>
+        <w:t xml:space="preserve">•  Go through the Language Bank on screen together. Choral-read 2–3 lines from each category aloud.</w:t>
       </w:r>
     </w:p>
     <w:p>
@@ -1949,7 +2000,7 @@
           <w:sz w:val="20"/>
           <w:szCs w:val="20"/>
         </w:rPr>
-        <w:t xml:space="preserve">•  As a whole class, fill in the 5 planning boxes on the board (same boxes are on the worksheet):</w:t>
+        <w:t xml:space="preserve">•  As a whole class, fill in the 5 planning boxes on the board (same questions shown on screen):</w:t>
       </w:r>
     </w:p>
     <w:p>
@@ -2062,7 +2113,7 @@
           <w:sz w:val="20"/>
           <w:szCs w:val="20"/>
         </w:rPr>
-        <w:t xml:space="preserve">•  Students copy the finished model into the "Guided Example" box on their worksheet. They will be able to look back at this during the final task.</w:t>
+        <w:t xml:space="preserve">•  Leave the finished model visible on screen (or copied onto the board) so students can look back at it during the final task.</w:t>
       </w:r>
     </w:p>
     <w:p>
@@ -2127,7 +2178,7 @@
           <w:sz w:val="20"/>
           <w:szCs w:val="20"/>
         </w:rPr>
-        <w:t xml:space="preserve">•  Students choose ONE of the 4 scenarios on the worksheet (catering/dietary, schedule change, venue/equipment, or a client request that cannot be fully met). All 4 are equally manageable at A1–A2.</w:t>
+        <w:t xml:space="preserve">•  Students choose ONE of the 4 scenarios, previewed on screen and printed on the output worksheet (catering/dietary, schedule change, venue/equipment, or a client request that cannot be fully met). All 4 are equally manageable at A1–A2.</w:t>
       </w:r>
     </w:p>
     <w:p>

</xml_diff>

<commit_message>
American English pass: enquiry/enquire/Apologising fixes site-wide
Found via a full case-insensitive re-audit: Wellness Unit 4's vocab
word and reflection item ("enquiry"), a quiz answer option
("Enquiry"), and "Apologising" in the new Integrated Email Lesson
(both the site and its teacher plan docx), which hadn't been caught
since it was written after the last American English pass. Remaining
grep hits are legitimate exemptions: CSS developer comments, an
internal JS boolean variable name, and a verbatim TQF CLO3 quote in
teacher-data.js.

Co-Authored-By: Claude Sonnet 5 <noreply@anthropic.com>
</commit_message>
<xml_diff>
--- a/_deliverables/MICE-IntegratedEmailLesson-TeacherPlan.docx
+++ b/_deliverables/MICE-IntegratedEmailLesson-TeacherPlan.docx
@@ -383,7 +383,7 @@
                 <w:sz w:val="19"/>
                 <w:szCs w:val="19"/>
               </w:rPr>
-              <w:t xml:space="preserve">Week 11 (Apologising &amp; Saying No), Week 12 (Handling Complaints), Week 13 (Working Across Cultures), Week 14 (Professional Email &amp; Business Writing – home week), Week 15 (Catering &amp; Wellness Services)</w:t>
+              <w:t xml:space="preserve">Week 11 (Apologizing &amp; Saying No), Week 12 (Handling Complaints), Week 13 (Working Across Cultures), Week 14 (Professional Email &amp; Business Writing – home week), Week 15 (Catering &amp; Wellness Services)</w:t>
             </w:r>
           </w:p>
         </w:tc>
@@ -3414,7 +3414,7 @@
                 <w:sz w:val="18"/>
                 <w:szCs w:val="18"/>
               </w:rPr>
-              <w:t xml:space="preserve">Apologising &amp; Saying No Professionally</w:t>
+              <w:t xml:space="preserve">Apologizing &amp; Saying No Professionally</w:t>
             </w:r>
           </w:p>
         </w:tc>
@@ -3762,7 +3762,7 @@
           <w:sz w:val="19"/>
           <w:szCs w:val="19"/>
         </w:rPr>
-        <w:t xml:space="preserve">This lesson does not reteach complaint handling, apologising, or cultural awareness as new content. It is built so that students apply language they already know inside a new, broader professional-email context — as requested.</w:t>
+        <w:t xml:space="preserve">This lesson does not reteach complaint handling, apologizing, or cultural awareness as new content. It is built so that students apply language they already know inside a new, broader professional-email context — as requested.</w:t>
       </w:r>
     </w:p>
     <w:sectPr>

</xml_diff>